<commit_message>
Apply the audit corrections to the Word files (inserted figures kept)
- exact date-permutation p-values in Section 4.8, Table 5, Table S-6 and the SI text
- Fig. 6 / Fig. S-4: actual window-selection rule stated; 'before the predictions were
  inspected' removed (not documented)
- Methods: lambda_1 = 0.1, lambda_2 = 0.05, lambda_3 = 0.1; Dice normalisation and the
  gradient-magnitude constant from qpi/training/losses.py
- Fig. 8 and Fig. S-2 replaced; unused picture-bullet image removed from the SI
- for_submission/ holds only the two documents and their PDFs

Co-Authored-By: Claude Opus 5.5 <noreply@anthropic.com>
Claude-Session: https://claude.ai/code/session_01VfeP9iXHsiwMyJPGSYpWbp
</commit_message>
<xml_diff>
--- a/artifacts/manuscript_final/revised_manuscript_final.docx
+++ b/artifacts/manuscript_final/revised_manuscript_final.docx
@@ -2969,7 +2969,115 @@
         <w:rPr>
           <w:rFonts w:ascii="Times New Roman" w:eastAsia="Times New Roman" w:hAnsi="Times New Roman" w:cs="Times New Roman"/>
         </w:rPr>
-        <w:t>The Dice term is computed from the softmax probabilities over annotated pixels, per image, and averaged over the images of a batch. All loss terms are evaluated in single precision, outside the mixed-precision autocast used for the network forward pass.</w:t>
+        <w:t xml:space="preserve">The Dice term is computed from the </w:t>
+      </w:r>
+      <w:proofErr w:type="spellStart"/>
+      <w:r>
+        <w:rPr>
+          <w:rFonts w:ascii="Times New Roman" w:eastAsia="Times New Roman" w:hAnsi="Times New Roman" w:cs="Times New Roman"/>
+        </w:rPr>
+        <w:t>softmax</w:t>
+      </w:r>
+      <w:proofErr w:type="spellEnd"/>
+      <w:r>
+        <w:rPr>
+          <w:rFonts w:ascii="Times New Roman" w:eastAsia="Times New Roman" w:hAnsi="Times New Roman" w:cs="Times New Roman"/>
+        </w:rPr>
+        <w:t xml:space="preserve"> probabilities over annotated </w:t>
+      </w:r>
+      <w:proofErr w:type="gramStart"/>
+      <w:r>
+        <w:rPr>
+          <w:rFonts w:ascii="Times New Roman" w:eastAsia="Times New Roman" w:hAnsi="Times New Roman" w:cs="Times New Roman"/>
+        </w:rPr>
+        <w:t>pixels,</w:t>
+      </w:r>
+      <w:proofErr w:type="gramEnd"/>
+      <w:r>
+        <w:rPr>
+          <w:rFonts w:ascii="Times New Roman" w:eastAsia="Times New Roman" w:hAnsi="Times New Roman" w:cs="Times New Roman"/>
+        </w:rPr>
+        <w:t xml:space="preserve"> per image, and averaged over the images of a batch. All loss terms are evaluated in single precision, outside the </w:t>
+      </w:r>
+      <w:proofErr w:type="gramStart"/>
+      <w:r>
+        <w:rPr>
+          <w:rFonts w:ascii="Times New Roman" w:eastAsia="Times New Roman" w:hAnsi="Times New Roman" w:cs="Times New Roman"/>
+        </w:rPr>
+        <w:t>mixed-precision</w:t>
+      </w:r>
+      <w:proofErr w:type="gramEnd"/>
+      <w:r>
+        <w:rPr>
+          <w:rFonts w:ascii="Times New Roman" w:eastAsia="Times New Roman" w:hAnsi="Times New Roman" w:cs="Times New Roman"/>
+        </w:rPr>
+        <w:t xml:space="preserve"> </w:t>
+      </w:r>
+      <w:proofErr w:type="spellStart"/>
+      <w:r>
+        <w:rPr>
+          <w:rFonts w:ascii="Times New Roman" w:eastAsia="Times New Roman" w:hAnsi="Times New Roman" w:cs="Times New Roman"/>
+        </w:rPr>
+        <w:t>autocast</w:t>
+      </w:r>
+      <w:proofErr w:type="spellEnd"/>
+      <w:r>
+        <w:rPr>
+          <w:rFonts w:ascii="Times New Roman" w:eastAsia="Times New Roman" w:hAnsi="Times New Roman" w:cs="Times New Roman"/>
+        </w:rPr>
+        <w:t xml:space="preserve"> used for the network forward pass.</w:t>
+      </w:r>
+      <w:r>
+        <w:rPr>
+          <w:rFonts w:ascii="Times New Roman" w:eastAsia="Times New Roman" w:hAnsi="Times New Roman" w:cs="Times New Roman"/>
+          <w:highlight w:val="yellow"/>
+        </w:rPr>
+        <w:t xml:space="preserve"> In the implementation, the weighted sum over classes is divided by Σ</w:t>
+      </w:r>
+      <w:r>
+        <w:rPr>
+          <w:rFonts w:ascii="Times New Roman" w:eastAsia="Times New Roman" w:hAnsi="Times New Roman" w:cs="Times New Roman"/>
+          <w:highlight w:val="yellow"/>
+          <w:vertAlign w:val="subscript"/>
+        </w:rPr>
+        <w:t xml:space="preserve">c</w:t>
+      </w:r>
+      <w:r>
+        <w:rPr>
+          <w:rFonts w:ascii="Times New Roman" w:eastAsia="Times New Roman" w:hAnsi="Times New Roman" w:cs="Times New Roman"/>
+          <w:highlight w:val="yellow"/>
+        </w:rPr>
+        <w:t xml:space="preserve"> w</w:t>
+      </w:r>
+      <w:r>
+        <w:rPr>
+          <w:rFonts w:ascii="Times New Roman" w:eastAsia="Times New Roman" w:hAnsi="Times New Roman" w:cs="Times New Roman"/>
+          <w:highlight w:val="yellow"/>
+          <w:vertAlign w:val="subscript"/>
+        </w:rPr>
+        <w:t xml:space="preserve">c</w:t>
+      </w:r>
+      <w:r>
+        <w:rPr>
+          <w:rFonts w:ascii="Times New Roman" w:eastAsia="Times New Roman" w:hAnsi="Times New Roman" w:cs="Times New Roman"/>
+          <w:highlight w:val="yellow"/>
+        </w:rPr>
+        <w:t xml:space="preserve"> + 10</w:t>
+      </w:r>
+      <w:r>
+        <w:rPr>
+          <w:rFonts w:ascii="Times New Roman" w:eastAsia="Times New Roman" w:hAnsi="Times New Roman" w:cs="Times New Roman"/>
+          <w:highlight w:val="yellow"/>
+          <w:vertAlign w:val="superscript"/>
+        </w:rPr>
+        <w:t xml:space="preserve">−4</w:t>
+      </w:r>
+      <w:r>
+        <w:rPr>
+          <w:rFonts w:ascii="Times New Roman" w:eastAsia="Times New Roman" w:hAnsi="Times New Roman" w:cs="Times New Roman"/>
+          <w:highlight w:val="yellow"/>
+        </w:rPr>
+        <w:t xml:space="preserve">.</w:t>
       </w:r>
     </w:p>
     <w:p>
@@ -3460,7 +3568,14 @@
         <w:rPr>
           <w:rFonts w:ascii="Times New Roman" w:eastAsia="Times New Roman" w:hAnsi="Times New Roman" w:cs="Times New Roman"/>
         </w:rPr>
-        <w:t xml:space="preserve"> scale. The segmentation boundary is then structurally aligned with strong phase gradients via an </w:t>
+        <w:t xml:space="preserve"> scale. The segmentation boundary </w:t>
+      </w:r>
+      <w:r>
+        <w:rPr>
+          <w:rFonts w:ascii="Times New Roman" w:eastAsia="Times New Roman" w:hAnsi="Times New Roman" w:cs="Times New Roman"/>
+        </w:rPr>
+        <w:lastRenderedPageBreak/>
+        <w:t xml:space="preserve">is then structurally aligned with strong phase gradients via an </w:t>
       </w:r>
       <m:oMath>
         <m:sSub>
@@ -3506,7 +3621,14 @@
           <w:rFonts w:ascii="Times New Roman" w:eastAsia="Times New Roman" w:hAnsi="Times New Roman" w:cs="Times New Roman"/>
           <w:highlight w:val="yellow"/>
         </w:rPr>
-        <w:t xml:space="preserve">implemented as the mean absolute difference over annotated pixels (gradients are forward differences, a one-pixel rim next to unannotated pixels is excluded, and </w:t>
+        <w:t>implemented as the mean absolute difference over annotated pixels (gradients are forward differences, a one-pixel rim next to unannotated pixels is excluded, and</w:t>
+      </w:r>
+      <w:r>
+        <w:rPr>
+          <w:rFonts w:ascii="Times New Roman" w:eastAsia="Times New Roman" w:hAnsi="Times New Roman" w:cs="Times New Roman"/>
+          <w:highlight w:val="yellow"/>
+        </w:rPr>
+        <w:t xml:space="preserve"> </w:t>
       </w:r>
       <m:oMath>
         <m:r>
@@ -3552,6 +3674,89 @@
           <w:highlight w:val="yellow"/>
         </w:rPr>
         <w:t>.</w:t>
+      </w:r>
+      <w:r>
+        <w:rPr>
+          <w:rFonts w:ascii="Times New Roman" w:eastAsia="Times New Roman" w:hAnsi="Times New Roman" w:cs="Times New Roman"/>
+          <w:highlight w:val="yellow"/>
+        </w:rPr>
+        <w:t xml:space="preserve"> The gradient magnitude is computed as (∂</w:t>
+      </w:r>
+      <w:r>
+        <w:rPr>
+          <w:rFonts w:ascii="Times New Roman" w:eastAsia="Times New Roman" w:hAnsi="Times New Roman" w:cs="Times New Roman"/>
+          <w:highlight w:val="yellow"/>
+          <w:vertAlign w:val="subscript"/>
+        </w:rPr>
+        <w:t xml:space="preserve">x</w:t>
+      </w:r>
+      <w:r>
+        <w:rPr>
+          <w:rFonts w:ascii="Times New Roman" w:eastAsia="Times New Roman" w:hAnsi="Times New Roman" w:cs="Times New Roman"/>
+          <w:highlight w:val="yellow"/>
+          <w:vertAlign w:val="superscript"/>
+        </w:rPr>
+        <w:t xml:space="preserve">2</w:t>
+      </w:r>
+      <w:r>
+        <w:rPr>
+          <w:rFonts w:ascii="Times New Roman" w:eastAsia="Times New Roman" w:hAnsi="Times New Roman" w:cs="Times New Roman"/>
+          <w:highlight w:val="yellow"/>
+        </w:rPr>
+        <w:t xml:space="preserve"> + ∂</w:t>
+      </w:r>
+      <w:r>
+        <w:rPr>
+          <w:rFonts w:ascii="Times New Roman" w:eastAsia="Times New Roman" w:hAnsi="Times New Roman" w:cs="Times New Roman"/>
+          <w:highlight w:val="yellow"/>
+          <w:vertAlign w:val="subscript"/>
+        </w:rPr>
+        <w:t xml:space="preserve">y</w:t>
+      </w:r>
+      <w:r>
+        <w:rPr>
+          <w:rFonts w:ascii="Times New Roman" w:eastAsia="Times New Roman" w:hAnsi="Times New Roman" w:cs="Times New Roman"/>
+          <w:highlight w:val="yellow"/>
+          <w:vertAlign w:val="superscript"/>
+        </w:rPr>
+        <w:t xml:space="preserve">2</w:t>
+      </w:r>
+      <w:r>
+        <w:rPr>
+          <w:rFonts w:ascii="Times New Roman" w:eastAsia="Times New Roman" w:hAnsi="Times New Roman" w:cs="Times New Roman"/>
+          <w:highlight w:val="yellow"/>
+        </w:rPr>
+        <w:t xml:space="preserve"> + 10</w:t>
+      </w:r>
+      <w:r>
+        <w:rPr>
+          <w:rFonts w:ascii="Times New Roman" w:eastAsia="Times New Roman" w:hAnsi="Times New Roman" w:cs="Times New Roman"/>
+          <w:highlight w:val="yellow"/>
+          <w:vertAlign w:val="superscript"/>
+        </w:rPr>
+        <w:t xml:space="preserve">−4</w:t>
+      </w:r>
+      <w:r>
+        <w:rPr>
+          <w:rFonts w:ascii="Times New Roman" w:eastAsia="Times New Roman" w:hAnsi="Times New Roman" w:cs="Times New Roman"/>
+          <w:highlight w:val="yellow"/>
+        </w:rPr>
+        <w:t xml:space="preserve">)</w:t>
+      </w:r>
+      <w:r>
+        <w:rPr>
+          <w:rFonts w:ascii="Times New Roman" w:eastAsia="Times New Roman" w:hAnsi="Times New Roman" w:cs="Times New Roman"/>
+          <w:highlight w:val="yellow"/>
+          <w:vertAlign w:val="superscript"/>
+        </w:rPr>
+        <w:t xml:space="preserve">1/2</w:t>
+      </w:r>
+      <w:r>
+        <w:rPr>
+          <w:rFonts w:ascii="Times New Roman" w:eastAsia="Times New Roman" w:hAnsi="Times New Roman" w:cs="Times New Roman"/>
+          <w:highlight w:val="yellow"/>
+        </w:rPr>
+        <w:t xml:space="preserve"> from forward differences before the max-normalization.</w:t>
       </w:r>
     </w:p>
     <w:p>
@@ -5118,6 +5323,58 @@
         </w:rPr>
         <w:t>.</w:t>
       </w:r>
+      <w:r>
+        <w:rPr>
+          <w:rFonts w:ascii="Times New Roman" w:eastAsia="Times New Roman" w:hAnsi="Times New Roman" w:cs="Times New Roman"/>
+          <w:highlight w:val="yellow"/>
+        </w:rPr>
+        <w:t xml:space="preserve"> In all experiments, λ</w:t>
+      </w:r>
+      <w:r>
+        <w:rPr>
+          <w:rFonts w:ascii="Times New Roman" w:eastAsia="Times New Roman" w:hAnsi="Times New Roman" w:cs="Times New Roman"/>
+          <w:highlight w:val="yellow"/>
+          <w:vertAlign w:val="subscript"/>
+        </w:rPr>
+        <w:t xml:space="preserve">1</w:t>
+      </w:r>
+      <w:r>
+        <w:rPr>
+          <w:rFonts w:ascii="Times New Roman" w:eastAsia="Times New Roman" w:hAnsi="Times New Roman" w:cs="Times New Roman"/>
+          <w:highlight w:val="yellow"/>
+        </w:rPr>
+        <w:t xml:space="preserve"> = 0.1, λ</w:t>
+      </w:r>
+      <w:r>
+        <w:rPr>
+          <w:rFonts w:ascii="Times New Roman" w:eastAsia="Times New Roman" w:hAnsi="Times New Roman" w:cs="Times New Roman"/>
+          <w:highlight w:val="yellow"/>
+          <w:vertAlign w:val="subscript"/>
+        </w:rPr>
+        <w:t xml:space="preserve">2</w:t>
+      </w:r>
+      <w:r>
+        <w:rPr>
+          <w:rFonts w:ascii="Times New Roman" w:eastAsia="Times New Roman" w:hAnsi="Times New Roman" w:cs="Times New Roman"/>
+          <w:highlight w:val="yellow"/>
+        </w:rPr>
+        <w:t xml:space="preserve"> = 0.05, and λ</w:t>
+      </w:r>
+      <w:r>
+        <w:rPr>
+          <w:rFonts w:ascii="Times New Roman" w:eastAsia="Times New Roman" w:hAnsi="Times New Roman" w:cs="Times New Roman"/>
+          <w:highlight w:val="yellow"/>
+          <w:vertAlign w:val="subscript"/>
+        </w:rPr>
+        <w:t xml:space="preserve">3</w:t>
+      </w:r>
+      <w:r>
+        <w:rPr>
+          <w:rFonts w:ascii="Times New Roman" w:eastAsia="Times New Roman" w:hAnsi="Times New Roman" w:cs="Times New Roman"/>
+          <w:highlight w:val="yellow"/>
+        </w:rPr>
+        <w:t xml:space="preserve"> = 0.1.</w:t>
+      </w:r>
     </w:p>
     <w:p>
       <w:pPr>
@@ -8451,7 +8708,7 @@
           <w:rFonts w:ascii="Times New Roman" w:eastAsia="Times New Roman" w:hAnsi="Times New Roman" w:cs="Times New Roman"/>
           <w:highlight w:val="yellow"/>
         </w:rPr>
-        <w:t xml:space="preserve">(20,000 permutations)</w:t>
+        <w:t xml:space="preserve">(exact test over all 11! = 39,916,800 permutations)</w:t>
       </w:r>
       <w:r>
         <w:rPr>
@@ -8511,7 +8768,7 @@
           <w:rFonts w:ascii="Times New Roman" w:eastAsia="Times New Roman" w:hAnsi="Times New Roman" w:cs="Times New Roman"/>
           <w:highlight w:val="yellow"/>
         </w:rPr>
-        <w:t xml:space="preserve">=8), each agreement and trend statistic was computed separately for each training seed (42, 43, 44) and is reported as mean ± SD (n − 1) over the three per-seed values; p-values are listed per seed and are not averaged, and cells are not pooled over seeds. To test whether the prediction error depended on storage time, the same date-clustered test was applied to the per-image difference between predicted and annotation-derived median dry mass. Permutation p-values are Monte Carlo estimates and can differ in the third decimal between runs.</w:t>
+        <w:t xml:space="preserve">=8), each agreement and trend statistic was computed separately for each training seed (42, 43, 44) and is reported as mean ± SD (n − 1) over the three per-seed values; p-values are listed per seed and are not averaged, and cells are not pooled over seeds. To test whether the prediction error depended on storage time, the same date-clustered test was applied to the per-image difference between predicted and annotation-derived median dry mass.</w:t>
       </w:r>
       <w:r>
         <w:rPr>
@@ -15605,7 +15862,7 @@
           <w:rFonts w:ascii="Times New Roman" w:eastAsia="Times New Roman" w:hAnsi="Times New Roman" w:cs="Times New Roman"/>
           <w:highlight w:val="yellow"/>
         </w:rPr>
-        <w:t xml:space="preserve">Qualitative results are shown in Fig. 6 for one 256 × 256 px window per annotated class, chosen from the annotation alone as the window with the most pixels of that class, before the predictions were inspected; all four predictions in the figure come from training seed 42. The windows are examples, not a statistical sample. In these windows, MobileNet-UNet assigned the cells annotated as spherocytes and stomatocytes to other classes, consistent with its Dice of zero for these classes (Fig. 3), whereas the SAM-based configurations assigned most annotated spherocytes, echinocytes, and stomatocytes to the annotated class, with most errors on stomatocytes; where cells touch, the predicted foreground of all models tended to form joined regions. These observations were quantified over all 66 validation images in a separate pixel-level analysis, for the training seeds given in parentheses, which are not all those of the figure. MobileNet-UNet (r=8; seed 42) predicted 68% of the annotated spherocyte pixels and 82% of the annotated stomatocyte pixels as discocyte. Of the annotated stomatocyte pixels, 68% were predicted as stomatocyte by MobileSAM (</w:t>
+        <w:t xml:space="preserve">Qualitative results are shown in Fig. 6 for one 256 × 256 px window per annotated class, selected from the annotation alone by a fixed rule: the validation image with the most annotated pixels of that class and, within that image, the window with the most pixels of that class on a 32 px grid. The windows are therefore not the maximum over all images and positions; they are examples, not a statistical sample. All four predictions in the figure come from training seed 42. In these windows, MobileNet-UNet assigned the cells annotated as spherocytes and stomatocytes to other classes, consistent with its Dice of zero for these classes (Fig. 3), whereas the SAM-based configurations assigned most annotated spherocytes, echinocytes, and stomatocytes to the annotated class, with most errors on stomatocytes; where cells touch, the predicted foreground of all models tended to form joined regions. These observations were quantified over all 66 validation images in a separate pixel-level analysis, for the training seeds given in parentheses, which are not all those of the figure. MobileNet-UNet (r=8; seed 42) predicted 68% of the annotated spherocyte pixels and 82% of the annotated stomatocyte pixels as discocyte. Of the annotated stomatocyte pixels, 68% were predicted as stomatocyte by MobileSAM (</w:t>
       </w:r>
       <w:r>
         <w:rPr>
@@ -15779,7 +16036,7 @@
           <w:szCs w:val="22"/>
           <w:highlight w:val="yellow"/>
         </w:rPr>
-        <w:t>Fig. 6</w:t>
+        <w:t xml:space="preserve">Fig. 6</w:t>
       </w:r>
       <w:r>
         <w:rPr>
@@ -15789,7 +16046,17 @@
           <w:szCs w:val="22"/>
           <w:highlight w:val="yellow"/>
         </w:rPr>
-        <w:t xml:space="preserve"> Qualitative segmentation in four 256 × 256 px validation windows, one per annotated class (rows; mask values 1 to 4). Columns: phase, annotation, and the predictions of MobileNet-UNet (</w:t>
+        <w:t xml:space="preserve"> </w:t>
+      </w:r>
+      <w:r>
+        <w:rPr>
+          <w:rFonts w:ascii="Times New Roman" w:eastAsia="Times New Roman" w:hAnsi="Times New Roman" w:cs="Times New Roman"/>
+          <w:color w:val="000000"/>
+          <w:sz w:val="22"/>
+          <w:szCs w:val="22"/>
+          <w:highlight w:val="yellow"/>
+        </w:rPr>
+        <w:t xml:space="preserve">Qualitative segmentation in four 256 × 256 px validation windows, one per annotated class (rows; mask values 1 to 4; selection rule in Section 4.6). Columns: phase, annotation, and the predictions of MobileNet-UNet (</w:t>
       </w:r>
       <w:r>
         <w:rPr>
@@ -15801,7 +16068,7 @@
           <w:szCs w:val="22"/>
           <w:highlight w:val="yellow"/>
         </w:rPr>
-        <w:t>r</w:t>
+        <w:t xml:space="preserve">r</w:t>
       </w:r>
       <w:r>
         <w:rPr>
@@ -15811,7 +16078,7 @@
           <w:szCs w:val="22"/>
           <w:highlight w:val="yellow"/>
         </w:rPr>
-        <w:t>=8), MobileSAM (</w:t>
+        <w:t xml:space="preserve">=8), MobileSAM (</w:t>
       </w:r>
       <w:r>
         <w:rPr>
@@ -15823,7 +16090,7 @@
           <w:szCs w:val="22"/>
           <w:highlight w:val="yellow"/>
         </w:rPr>
-        <w:t>r</w:t>
+        <w:t xml:space="preserve">r</w:t>
       </w:r>
       <w:r>
         <w:rPr>
@@ -15833,7 +16100,7 @@
           <w:szCs w:val="22"/>
           <w:highlight w:val="yellow"/>
         </w:rPr>
-        <w:t>=8), EdgeSAM (</w:t>
+        <w:t xml:space="preserve">=8), EdgeSAM (</w:t>
       </w:r>
       <w:r>
         <w:rPr>
@@ -15845,7 +16112,7 @@
           <w:szCs w:val="22"/>
           <w:highlight w:val="yellow"/>
         </w:rPr>
-        <w:t>r</w:t>
+        <w:t xml:space="preserve">r</w:t>
       </w:r>
       <w:r>
         <w:rPr>
@@ -15855,7 +16122,7 @@
           <w:szCs w:val="22"/>
           <w:highlight w:val="yellow"/>
         </w:rPr>
-        <w:t>=8), and EdgeSAM (</w:t>
+        <w:t xml:space="preserve">=8), and EdgeSAM (</w:t>
       </w:r>
       <w:r>
         <w:rPr>
@@ -15867,7 +16134,7 @@
           <w:szCs w:val="22"/>
           <w:highlight w:val="yellow"/>
         </w:rPr>
-        <w:t>r</w:t>
+        <w:t xml:space="preserve">r</w:t>
       </w:r>
       <w:r>
         <w:rPr>
@@ -15877,7 +16144,7 @@
           <w:szCs w:val="22"/>
           <w:highlight w:val="yellow"/>
         </w:rPr>
-        <w:t>=32), all from training seed 42. Grey: outside the annotated field of view.</w:t>
+        <w:t xml:space="preserve">=32), all from training seed 42. Grey: outside the annotated field of view.</w:t>
       </w:r>
     </w:p>
     <w:p>
@@ -16252,7 +16519,7 @@
           <w:rFonts w:ascii="Times New Roman" w:eastAsia="Times New Roman" w:hAnsi="Times New Roman" w:cs="Times New Roman"/>
           <w:highlight w:val="yellow"/>
         </w:rPr>
-        <w:t xml:space="preserve">=32) predictions contain 1,338, 1,378, 1,437 kept components for seeds 42, 43, and 44 (Table S-4). Projected cell area decreased with storage (Fig. 8b, Table 5): between early (days 0 to 8) and late storage (days 37 to 47), the median area changed by −43.9% in the annotation and by −44.3 ± 1.2% in the predictions. With the 11 acquisition dates as clusters, the permutation p-value of this trend was 0.019 for the annotation and 0.001, 0.007, 0.005 for seeds 42, 43, and 44. The 95% date-bootstrap intervals of the Spearman correlation excluded zero for the three seeds (−0.93 to −0.27; −0.86 to −0.09; −0.86 to −0.10) but not for the annotation (−0.85 to 0.03), so for the annotation the decrease is borderline under date clustering. The median dry mass changed by −0.8% in the annotation and by −6.1 ± 0.3% in the predictions, but a decrease was not statistically supported under date clustering (p = 0.27 for the annotation and 0.11, 0.17, 0.083 for the three seeds; every bootstrap interval included zero; Table S-6). Treating the 66 images as independent observations would give p = 0.008, 0.052, 0.036 for the three seeds, but this ignores that the six images of a date come from the same samples and is therefore not used. The absence of a supported trend is not evidence that dry mass was constant, because a test with 11 clusters has limited power. The change in projected area was thus not accompanied by a statistically supported change in phase-derived dry mass (Fig. 8b, c).</w:t>
+        <w:t xml:space="preserve">=32) predictions contain 1,338, 1,378, 1,437 kept components for seeds 42, 43, and 44 (Table S-4). Projected cell area decreased with storage (Fig. 8b, Table 5): between early (days 0 to 8) and late storage (days 37 to 47), the median area changed by −43.9% in the annotation and by −44.3 ± 1.2% in the predictions. With the 11 acquisition dates as clusters, the permutation p-value of this trend was 0.018 for the annotation and 0.001, 0.007, 0.005 for seeds 42, 43, and 44. The 95% date-bootstrap intervals of the Spearman correlation excluded zero for the three seeds (−0.93 to −0.27; −0.87 to −0.10; −0.86 to −0.10) but not for the annotation (−0.85 to 0.04), so for the annotation the decrease is borderline under date clustering. The median dry mass changed by −0.8% in the annotation and by −6.1 ± 0.3% in the predictions, but a decrease was not statistically supported under date clustering (p = 0.27 for the annotation and 0.10, 0.17, 0.090 for the three seeds; every bootstrap interval included zero; Table S-6). Treating the 66 images as independent observations would give p = 0.008, 0.052, 0.036 for the three seeds, but this ignores that the six images of a date come from the same samples and is therefore not used. The absence of a supported trend is not evidence that dry mass was constant, because a test with 11 clusters has limited power. The change in projected area was thus not accompanied by a statistically supported change in phase-derived dry mass (Fig. 8b, c).</w:t>
       </w:r>
     </w:p>
     <w:p>
@@ -16317,7 +16584,7 @@
           <w:rFonts w:ascii="Times New Roman" w:eastAsia="Times New Roman" w:hAnsi="Times New Roman" w:cs="Times New Roman"/>
           <w:highlight w:val="yellow"/>
         </w:rPr>
-        <w:t xml:space="preserve">=32), this correlation was weakly negative (Spearman ρ = −0.29, −0.21, −0.23 for the three seeds) but not statistically supported (p = 0.078, 0.20, 0.090; every bootstrap interval included zero), and for MobileSAM (</w:t>
+        <w:t xml:space="preserve">=32), this correlation was weakly negative (Spearman ρ = −0.29, −0.21, −0.23 for the three seeds) but not statistically supported (p = 0.080, 0.20, 0.088; every bootstrap interval included zero), and for MobileSAM (</w:t>
       </w:r>
       <w:r>
         <w:rPr>
@@ -16333,7 +16600,7 @@
           <w:rFonts w:ascii="Times New Roman" w:eastAsia="Times New Roman" w:hAnsi="Times New Roman" w:cs="Times New Roman"/>
           <w:highlight w:val="yellow"/>
         </w:rPr>
-        <w:t xml:space="preserve">=8) no association was found (p = 0.79, 0.63, 0.98). The larger early-to-late change in the predicted than in the annotated dry mass therefore cannot be attributed to a storage-dependent bias with these data. Both segmentations are evaluated on the same phase maps, each with its own background estimate, so these values describe agreement between segmentations and not the accuracy of absolute dry mass (Section 2.6).</w:t>
+        <w:t xml:space="preserve">=8) no association was found (p = 0.78, 0.63, 0.98). The larger early-to-late change in the predicted than in the annotated dry mass therefore cannot be attributed to a storage-dependent bias with these data. Both segmentations are evaluated on the same phase maps, each with its own background estimate, so these values describe agreement between segmentations and not the accuracy of absolute dry mass (Section 2.6).</w:t>
       </w:r>
     </w:p>
     <w:p>
@@ -16395,7 +16662,7 @@
           <w:rFonts w:ascii="Times New Roman" w:eastAsia="Times New Roman" w:hAnsi="Times New Roman" w:cs="Times New Roman"/>
           <w:highlight w:val="yellow"/>
         </w:rPr>
-        <w:t xml:space="preserve">=8), the early-to-late change was −40.6 ± 1.3% for area (p = 0.005, 0.006, 0.027; the bootstrap interval excluded zero for 2 of the 3 seeds) and −2.6 ± 0.4% for dry mass (p = 0.36, 0.24, 0.33) (Table 5, Table S-5).</w:t>
+        <w:t xml:space="preserve">=8), the early-to-late change was −40.6 ± 1.3% for area (p = 0.005, 0.006, 0.024; the bootstrap interval excluded zero for 2 of the 3 seeds) and −2.6 ± 0.4% for dry mass (p = 0.35, 0.24, 0.34) (Table 5, Table S-5).</w:t>
       </w:r>
     </w:p>
     <w:p>
@@ -16846,7 +17113,7 @@
                 <w:szCs w:val="17"/>
                 <w:highlight w:val="yellow"/>
               </w:rPr>
-              <w:t xml:space="preserve">0.019</w:t>
+              <w:t xml:space="preserve">0.018</w:t>
             </w:r>
           </w:p>
         </w:tc>
@@ -17123,7 +17390,7 @@
                 <w:szCs w:val="17"/>
                 <w:highlight w:val="yellow"/>
               </w:rPr>
-              <w:t xml:space="preserve">0.11, 0.17, 0.083</w:t>
+              <w:t xml:space="preserve">0.10, 0.17, 0.090</w:t>
             </w:r>
           </w:p>
         </w:tc>
@@ -17144,7 +17411,7 @@
                 <w:szCs w:val="17"/>
                 <w:highlight w:val="yellow"/>
               </w:rPr>
-              <w:t xml:space="preserve">0.078, 0.20, 0.090</w:t>
+              <w:t xml:space="preserve">0.080, 0.20, 0.088</w:t>
             </w:r>
           </w:p>
         </w:tc>
@@ -17316,7 +17583,7 @@
                 <w:szCs w:val="17"/>
                 <w:highlight w:val="yellow"/>
               </w:rPr>
-              <w:t xml:space="preserve">0.005, 0.006, 0.027</w:t>
+              <w:t xml:space="preserve">0.005, 0.006, 0.024</w:t>
             </w:r>
           </w:p>
         </w:tc>
@@ -17358,7 +17625,7 @@
                 <w:szCs w:val="17"/>
                 <w:highlight w:val="yellow"/>
               </w:rPr>
-              <w:t xml:space="preserve">0.36, 0.24, 0.33</w:t>
+              <w:t xml:space="preserve">0.35, 0.24, 0.34</w:t>
             </w:r>
           </w:p>
         </w:tc>
@@ -17379,7 +17646,7 @@
                 <w:szCs w:val="17"/>
                 <w:highlight w:val="yellow"/>
               </w:rPr>
-              <w:t xml:space="preserve">0.79, 0.63, 0.98</w:t>
+              <w:t xml:space="preserve">0.78, 0.63, 0.98</w:t>
             </w:r>
           </w:p>
         </w:tc>
@@ -17401,7 +17668,7 @@
           <w:szCs w:val="16"/>
           <w:highlight w:val="yellow"/>
         </w:rPr>
-        <w:t xml:space="preserve">MdARE, bias, Pearson r, and CCC compare the per-image median dry mass of prediction and annotation. Δ: change of the median of the per-image medians between early (days 0 to 8, 18 images) and late storage (days 37 to 47, 12 images). p: two-sided permutation test of the image-level Spearman correlation with storage day, permuting the 11 acquisition dates as whole blocks (20,000 permutations); bias vs day: the same test on the per-image difference prediction − annotation. Wrapped cells excluded. Bootstrap intervals and per-day values: Tables S-4 to S-6. Absolute dry mass was not independently validated.</w:t>
+        <w:t xml:space="preserve">MdARE, bias, Pearson r, and CCC compare the per-image median dry mass of prediction and annotation. Δ: change of the median of the per-image medians between early (days 0 to 8, 18 images) and late storage (days 37 to 47, 12 images). p: two-sided permutation test of the image-level Spearman correlation with storage day, permuting the 11 acquisition dates as whole blocks (exact test over all 11! permutations); bias vs day: the same test on the per-image difference prediction − annotation. Wrapped cells excluded. Bootstrap intervals and per-day values: Tables S-4 to S-6. Absolute dry mass was not independently validated.</w:t>
       </w:r>
     </w:p>
     <w:p>
@@ -17421,7 +17688,7 @@
         <w:lastRenderedPageBreak/>
         <w:drawing>
           <wp:inline distT="0" distB="0" distL="0" distR="0" wp14:anchorId="5B95B0A3" wp14:editId="52298E62">
-            <wp:extent cx="6309360" cy="3118498"/>
+            <wp:extent cx="6309360" cy="3232211"/>
             <wp:effectExtent l="0" t="0" r="0" b="0"/>
             <wp:docPr id="864685550" name="Picture 1"/>
             <wp:cNvGraphicFramePr>
@@ -17446,7 +17713,7 @@
                   <pic:spPr bwMode="auto">
                     <a:xfrm>
                       <a:off x="0" y="0"/>
-                      <a:ext cx="6309360" cy="3118498"/>
+                      <a:ext cx="6309360" cy="3232211"/>
                     </a:xfrm>
                     <a:prstGeom prst="rect">
                       <a:avLst/>

</xml_diff>